<commit_message>
Fig. 1 lists all external data; explain marks in Fig. 6c and 7d legends
</commit_message>
<xml_diff>
--- a/SisFatee.docx
+++ b/SisFatee.docx
@@ -1246,7 +1246,7 @@
           <w:sz w:val="19"/>
           <w:szCs w:val="19"/>
         </w:rPr>
-        <w:t xml:space="preserve">, Expression AUROC before and after residualising on log clone size, with the likelihood-ratio test for adding expression to clone size.</w:t>
+        <w:t xml:space="preserve">, Expression AUROC before and after residualising on log clone size; asterisks mark treatments in which expression added to clone size (likelihood-ratio p &lt; 0.05).</w:t>
       </w:r>
     </w:p>
     <w:p>
@@ -1454,7 +1454,7 @@
           <w:sz w:val="19"/>
           <w:szCs w:val="19"/>
         </w:rPr>
-        <w:t xml:space="preserve">, Change in signature score from treatment-naive to post-treatment malignant cells in 11 patients with high-grade serous ovarian cancer receiving neoadjuvant platinum–taxane chemotherapy (Zhang et al., 2022); one dot per patient, filled where both samples came from the same anatomical site; the vertical line is the median and the grey band spans ±2 s.d. of the medians of 200 expression-matched random gene sets.</w:t>
+        <w:t xml:space="preserve">, Change in signature score from treatment-naive to post-treatment malignant cells in 11 patients with high-grade serous ovarian cancer receiving neoadjuvant platinum–taxane chemotherapy (Zhang et al., 2022); one dot per patient, filled where both samples came from the same anatomical site; the vertical line is the median (red for the fitness signature, the only one with Wilcoxon p &lt; 0.05) and the grey band spans ±2 s.d. of the medians of 200 expression-matched random gene sets.</w:t>
       </w:r>
     </w:p>
     <w:p>

</xml_diff>

<commit_message>
State four contributions; add the cell-independence limitation of differential expression (checked by the audit)
</commit_message>
<xml_diff>
--- a/SisFatee.docx
+++ b/SisFatee.docx
@@ -194,7 +194,7 @@
         <w:jc w:val="both"/>
       </w:pPr>
       <w:r>
-        <w:t xml:space="preserve">This leaves three questions open. First, how much does a cell's pre-treatment transcriptome say about its sister's fate when a model is trained directly on the lineage labels? Second, how much of that signal is specific to the drug, rather than the growth and recovery advantage that the control arm was designed to reveal? Third, what is the best performance one could hope for, given that the label belongs to a different cell? We answer each question on the ReSisTrace data (Fig. 1a). We then test the answers against technical confounders, a second lineage-tracing system, two further lineage data sets, bulk tumours and patients. Our contributions are threefold. First, we separate drug-specific tolerance from general growth fitness by comparing each predictor with a model trained on the untreated arm, at equal training size. Second, we bound the best performance achievable given that sisters are not identical, and check both estimators on synthetic data where the true answer is known. Third, we release the evaluation as a reusable Python package.</w:t>
+        <w:t xml:space="preserve">This leaves three questions open. First, how much does a cell's pre-treatment transcriptome say about its sister's fate when a model is trained directly on the lineage labels? Second, how much of that signal is specific to the drug, rather than the growth and recovery advantage that the control arm was designed to reveal? Third, what is the best performance one could hope for, given that the label belongs to a different cell? We answer each question on the ReSisTrace data (Fig. 1a). We then test the answers against technical confounders, a second lineage-tracing system, two further lineage data sets, bulk tumours and patients. Our contributions are fourfold. First, we separate drug-specific tolerance from general growth fitness by comparing each predictor with a model trained on the untreated arm, at equal training size, and split what remains into a part shared with other treatments and a part unique to the drug. Second, we bound the best performance achievable given that sisters are not identical, and check both estimators on synthetic data where the true answer is known. Third, we re-score the pathway and HRD findings of the original study against its untreated arm. Fourth, we release the evaluation as a reusable Python package.</w:t>
       </w:r>
     </w:p>
     <w:p>
@@ -1622,7 +1622,7 @@
         <w:jc w:val="both"/>
       </w:pPr>
       <w:r>
-        <w:t xml:space="preserve">This study has limitations. First, ReSisTrace labels are noisy: cells whose sister was lost or only partially matched are counted as pre-sensitive, and our ceiling handles this only through an assumed noise level. Second, the ceiling rests on a simplified Gaussian liability model that assumes a single linear score, so it is approximate and, as shown above, an upper bound. Third, our copy-number clusters were inferred from expression and only weakly separated; they reproduced the published enrichment pattern, but they are not the original subclone calls, and copy number measured from DNA in the same cells, which this data set does not provide, would be needed to exclude a copy-number contribution completely. Fourth, all main analyses use one ovarian cancer cell line, and the external checks rely on clone-level labels, on bulk tumours, and on a patient cohort of 11 in which the two samples are different pieces of tissue rather than sisters, so a negative result there has several possible causes. Fifth, the second system has no drug-free arm, so clone size stands in for fitness there, and lineage detection stands in for survival. Our barcode assignment there is also simpler than the original authors', so our clone counts are not identical to theirs, although the conclusions held across the thresholds we tried. Finally, we tested one graph architecture with modest tuning, and used both foundation models as frozen feature extractors rather than fine-tuning them. A different design might do better, but the near-identical performance of very different models, from logistic regression to a 104-million-parameter transformer, suggests that the information, not the model, is the limit.</w:t>
+        <w:t xml:space="preserve">This study has limitations. First, ReSisTrace labels are noisy: cells whose sister was lost or only partially matched are counted as pre-sensitive, and our ceiling handles this only through an assumed noise level. Second, the ceiling rests on a simplified Gaussian liability model that assumes a single linear score, so it is approximate and, as shown above, an upper bound. Third, our copy-number clusters were inferred from expression and only weakly separated; they reproduced the published enrichment pattern, but they are not the original subclone calls, and copy number measured from DNA in the same cells, which this data set does not provide, would be needed to exclude a copy-number contribution completely. Fourth, differential expression treated the cells of a sample as independent observations. Because 90% of families consist of a single labelled cell, holding 81% of labelled cells, sisters add little dependence, but gene-level p-values may be slightly optimistic; all classifier evaluations kept families together. Fifth, all main analyses use one ovarian cancer cell line, and the external checks rely on clone-level labels, on bulk tumours, and on a patient cohort of 11 in which the two samples are different pieces of tissue rather than sisters, so a negative result there has several possible causes. Sixth, the second system has no drug-free arm, so clone size stands in for fitness there, and lineage detection stands in for survival. Our barcode assignment there is also simpler than the original authors', so our clone counts are not identical to theirs, although the conclusions held across the thresholds we tried. Finally, we tested one graph architecture with modest tuning, and used both foundation models as frozen feature extractors rather than fine-tuning them. A different design might do better, but the near-identical performance of very different models, from logistic regression to a 104-million-parameter transformer, suggests that the information, not the model, is the limit.</w:t>
       </w:r>
     </w:p>
     <w:p>

</xml_diff>

<commit_message>
Two authors and DIU affiliation; CI test workflow; superscripts in LaTeX builder; unused imports removed
Adds Khairum Jahan Roza as second author, updates declarations and cover letters, replaces the Zenodo
placeholder, adds a GitHub Actions test run, and builds PDFs of both journal versions.
</commit_message>
<xml_diff>
--- a/SisFatee.docx
+++ b/SisFatee.docx
@@ -19,21 +19,63 @@
       <w:r>
         <w:t xml:space="preserve">Rabeya Noor</w:t>
       </w:r>
-    </w:p>
-    <w:p>
-      <w:pPr>
-        <w:spacing w:after="160" w:line="360"/>
-        <w:jc w:val="both"/>
-      </w:pPr>
-      <w:r>
-        <w:t xml:space="preserve">Independent Researcher, Dhaka, Bangladesh</w:t>
-      </w:r>
-    </w:p>
-    <w:p>
-      <w:pPr>
-        <w:spacing w:after="160" w:line="360"/>
-        <w:jc w:val="both"/>
-      </w:pPr>
+      <w:r>
+        <w:rPr>
+          <w:vertAlign w:val="superscript"/>
+        </w:rPr>
+        <w:t xml:space="preserve">1*</w:t>
+      </w:r>
+      <w:r>
+        <w:t xml:space="preserve"> and Khairum Jahan Roza</w:t>
+      </w:r>
+      <w:r>
+        <w:rPr>
+          <w:vertAlign w:val="superscript"/>
+        </w:rPr>
+        <w:t xml:space="preserve">2</w:t>
+      </w:r>
+    </w:p>
+    <w:p>
+      <w:pPr>
+        <w:spacing w:after="160" w:line="360"/>
+        <w:jc w:val="both"/>
+      </w:pPr>
+      <w:r>
+        <w:rPr>
+          <w:vertAlign w:val="superscript"/>
+        </w:rPr>
+        <w:t xml:space="preserve">1</w:t>
+      </w:r>
+      <w:r>
+        <w:t xml:space="preserve">Department of Computer Science and Engineering, Daffodil International University, Daffodil Smart City, Birulia, Savar, Dhaka 1216, Bangladesh</w:t>
+      </w:r>
+    </w:p>
+    <w:p>
+      <w:pPr>
+        <w:spacing w:after="160" w:line="360"/>
+        <w:jc w:val="both"/>
+      </w:pPr>
+      <w:r>
+        <w:rPr>
+          <w:vertAlign w:val="superscript"/>
+        </w:rPr>
+        <w:t xml:space="preserve">2</w:t>
+      </w:r>
+      <w:r>
+        <w:t xml:space="preserve">[MEDICAL COLLEGE NAME], Dhaka, Bangladesh</w:t>
+      </w:r>
+    </w:p>
+    <w:p>
+      <w:pPr>
+        <w:spacing w:after="160" w:line="360"/>
+        <w:jc w:val="both"/>
+      </w:pPr>
+      <w:r>
+        <w:rPr>
+          <w:vertAlign w:val="superscript"/>
+        </w:rPr>
+        <w:t xml:space="preserve">*</w:t>
+      </w:r>
       <w:r>
         <w:rPr>
           <w:b/>
@@ -66,7 +108,7 @@
         <w:t xml:space="preserve">Background.</w:t>
       </w:r>
       <w:r>
-        <w:t xml:space="preserve"> Some cancer cells survive treatment without genetic change, and many studies suggest they can be recognised in advance from their gene expression. Sister-cell lineage tracing tests this directly: one daughter of a dividing cell is sequenced before treatment, the other is treated, and the treated sister's fate labels the sequenced cell. However, a cell whose sister survives may simply be a cell that grows well. How much of the predictable signal reflects drug tolerance rather than general growth fitness has not been measured. We measured it in the ReSisTrace experiment, which includes an identically processed untreated arm.</w:t>
+        <w:t xml:space="preserve"> Some cancer cells survive treatment without genetic change, and many studies suggest they can be recognised in advance from their gene expression. Sister-cell lineage tracing tests this: one daughter of a dividing cell is sequenced before treatment, the other is treated, and the treated sister's fate labels the sequenced cell. However, a cell whose sister survives may simply be a cell that grows well. How much of the predictable signal reflects drug tolerance rather than general growth fitness has not been measured. We measured it in the ReSisTrace experiment, which includes an identically processed untreated arm.</w:t>
       </w:r>
     </w:p>
     <w:p>
@@ -82,7 +124,7 @@
         <w:t xml:space="preserve">Results.</w:t>
       </w:r>
       <w:r>
-        <w:t xml:space="preserve"> We built an evaluation that compares each drug-arm predictor with a fitness model trained on the untreated arm at equal training size, and bounds what any predictor can reach given that sisters differ. Applied to 32,642 pre-treatment ovarian cancer cells, a simple linear model predicted the sister's fate (AUROC 0.72–0.75), far above published methods on the same task (0.50–0.60), and neither a graph neural network nor two single-cell foundation models did better. Yet the fitness model, which never saw a drug, predicted drug-arm fates almost as well (0.70–0.73). The drug-specific gain was about 0.02 AUROC: positive in every arm, too small for this experiment to separate from zero, and at most about 0.05. Point estimates placed most of it with the particular drug, not with treatment in general. A score that uses no labels recovered much of the signal, which marked a proliferative, low-stress state, and a link to homologous-recombination-deficient states reported with these data was as strong in untreated cells. In a second lineage system with six treatments, pre-treatment clone size outpredicted gene expression under every treatment, and in 11 patients the fitness state was depleted, not enriched, after chemotherapy.</w:t>
+        <w:t xml:space="preserve"> We built an evaluation that compares each drug-arm predictor with a fitness model trained on the untreated arm at equal training size, and bounds what any predictor can reach given that sisters differ. Applied to 32,642 pre-treatment ovarian cancer cells, a simple linear model predicted the sister's fate (AUROC 0.72–0.75), far above published methods on the same task (0.50–0.60), and neither a graph neural network nor two single-cell foundation models did better. Yet the fitness model, which never saw a drug, predicted drug-arm fates almost as well (0.70–0.73). The drug-specific gain was about 0.02 AUROC: positive in every arm, too small for this experiment to separate reliably from zero, and at most about 0.05. Point estimates placed most of it with the particular drug, not with treatment in general. A score that uses no labels recovered much of the signal, which marked a proliferative, low-stress state, and a link to homologous-recombination-deficient states reported with these data was as strong in untreated cells. In a second lineage system with six treatments, pre-treatment clone size outpredicted gene expression under every treatment, and in 11 patients the fitness state was depleted, not enriched, after chemotherapy.</w:t>
       </w:r>
     </w:p>
     <w:p>
@@ -748,7 +790,7 @@
         <w:jc w:val="both"/>
       </w:pPr>
       <w:r>
-        <w:t xml:space="preserve">Whether this gain would reappear in a new experiment is harder to establish, because the experiment is too small to resolve it. A design calculation shows that, with 3,879 labelled control families, the experiment can detect a gain of about 0.025 to 0.028 with 80% power, and every estimate falls below that. As expected from this, in the main analysis intervals that account for refitting the models do not exclude zero. When we repeated the whole procedure inside each of 200 bootstrap samples, refitting both models each time, the estimates were 0.017 for carboplatin (95% CI −0.0002 to 0.043), 0.022 for olaparib (−0.004 to 0.046) and 0.014 for NK (−0.010 to 0.043) (Table S27); the point estimates differ slightly from those above because the random training sets differ. Across all nine combinations of arm and preprocessing variant, the gain exceeded 0.01 in eight and was close to zero in the ninth (NK with all technical covariates removed, 0.001). Two intervals only just excluded zero, both with cell cycle removed (carboplatin 0.001 to 0.044, olaparib 0.0004 to 0.047). With nine overlapping comparisons and lower ends this close to zero, we do not count these as detections. Simpler intervals that resample only the evaluation, without refitting, do exclude zero in all three arms, but our simulations show that such intervals are too narrow (see below). The best summary is a drug-specific gain of about 0.02 AUROC that is consistent in sign but that this experiment cannot separate from zero. The same intervals also bound it from above, which is the more useful statement here: even at their upper ends, the gain is at most 0.043 to 0.046 AUROC, less than a fifth of the 0.22 to 0.25 by which the drug-arm models exceed chance. The data therefore do not merely fail to detect a large drug-specific component; they exclude one larger than about 0.05 AUROC.</w:t>
+        <w:t xml:space="preserve">Whether this gain would reappear in a new experiment is harder to establish, because the experiment is too small to resolve it. A design calculation shows that, with 3,879 labelled control families, the experiment can detect a gain of about 0.025 to 0.028 with 80% power, and every estimate falls below that. As expected from this, in the main analysis intervals that account for refitting the models do not exclude zero. When we repeated the whole procedure inside each of 200 bootstrap samples, refitting both models each time, the estimates were 0.017 for carboplatin (95% CI −0.0002 to 0.043), 0.022 for olaparib (−0.004 to 0.046) and 0.014 for NK (−0.010 to 0.043) (Table S27); the point estimates differ slightly from those above because the random training sets differ. Across all nine combinations of arm and preprocessing variant, the gain exceeded 0.01 in eight and was close to zero in the ninth (NK with all technical covariates removed, 0.001). Two intervals only just excluded zero, both with cell cycle removed (carboplatin 0.001 to 0.044, olaparib 0.0004 to 0.047). With nine overlapping comparisons and lower ends this close to zero, we do not count these as detections. The three-model bootstrap behind Fig. 3d, which draws its own training sets, gave total-gain intervals that excluded zero for olaparib (0.007 to 0.051) and NK (0.001 to 0.049) but not for carboplatin (−0.007 to 0.042) (Table S28). Whether an interval clears zero therefore depends on the random training sets, which is what an effect at the edge of detection looks like. Simpler intervals that resample only the evaluation, without refitting, do exclude zero in all three arms, but our simulations show that such intervals are too narrow (see below). The best summary is a drug-specific gain of about 0.02 AUROC that is consistent in sign but that this experiment cannot reliably separate from zero. The same intervals also bound it from above, which is the more useful statement here: even at their upper ends, the gain is at most 0.043 to 0.046 AUROC, less than a fifth of the 0.22 to 0.25 by which the drug-arm models exceed chance. The data therefore do not merely fail to detect a large drug-specific component; they exclude one larger than about 0.05 AUROC.</w:t>
       </w:r>
     </w:p>
     <w:p>
@@ -1454,7 +1496,7 @@
           <w:sz w:val="19"/>
           <w:szCs w:val="19"/>
         </w:rPr>
-        <w:t xml:space="preserve">, Change in signature score from treatment-naive to post-treatment malignant cells in 11 patients with high-grade serous ovarian cancer receiving neoadjuvant platinum–taxane chemotherapy (Zhang et al., 2022); one dot per patient, filled where both samples came from the same anatomical site; the vertical line is the median (red for the fitness signature, the only one with Wilcoxon p &lt; 0.05) and the grey band spans ±2 s.d. of the medians of 200 expression-matched random gene sets.</w:t>
+        <w:t xml:space="preserve">, Change in signature score from treatment-naive to post-treatment malignant cells in 11 patients with high-grade serous ovarian cancer receiving neoadjuvant platinum–taxane chemotherapy (Zhang et al., 2022); one dot per patient, filled where both samples came from the same anatomical site; the vertical line is the median (red for the fitness signature, the only one with Wilcoxon p &lt; 0.05) and the grey band spans the mean ± 2 s.d. of the medians of 200 expression-matched random gene sets.</w:t>
       </w:r>
     </w:p>
     <w:p>
@@ -1568,7 +1610,7 @@
         <w:jc w:val="both"/>
       </w:pPr>
       <w:r>
-        <w:t xml:space="preserve">We asked whether a cancer cell's transcriptome before treatment predicts whether its sister survives, and how much of that prediction is about the drug. The pre-treatment state is predictive: a simple model reaches AUROC 0.72–0.75, far above published methods on the same task. But most of the signal is not about the drug. A model trained on cells that never saw a drug predicts drug-arm fates nearly as well; a score that uses no labels recovers much of the same signal; and the shared component is a proliferative, low-stress state that fits an advantage in growing back after handling. The drug-specific remainder is biologically coherent, pointing to slower cycling among otherwise fit cells, and it is positive in every arm, but it is worth one to three points of AUROC and this experiment cannot separate it from zero once the uncertainty of fitting is counted. Point estimates suggest that most of that remainder is tied to the particular drug rather than to being treated at all, because a model trained on the other treated arms, at the same size, recovered only a fifth to a third of it, although this split is less certain than the gain itself and was clear only for olaparib.</w:t>
+        <w:t xml:space="preserve">We asked whether a cancer cell's transcriptome before treatment predicts whether its sister survives, and how much of that prediction is about the drug. The pre-treatment state is predictive: a simple model reaches AUROC 0.72–0.75, far above published methods on the same task. But most of the signal is not about the drug. A model trained on cells that never saw a drug predicts drug-arm fates nearly as well; a score that uses no labels recovers much of the same signal; and the shared component is a proliferative, low-stress state that fits an advantage in growing back after handling. The drug-specific remainder is biologically coherent, pointing to slower cycling among otherwise fit cells, and it is positive in every arm, but it is worth one to three points of AUROC and this experiment cannot reliably separate it from zero once the uncertainty of fitting is counted. Point estimates suggest that most of that remainder is tied to the particular drug rather than to being treated at all, because a model trained on the other treated arms, at the same size, recovered only a fifth to a third of it, although this split is less certain than the gain itself and was clear only for olaparib.</w:t>
       </w:r>
     </w:p>
     <w:p>
@@ -1613,7 +1655,7 @@
         <w:jc w:val="both"/>
       </w:pPr>
       <w:r>
-        <w:t xml:space="preserve">What should future studies do? The clearest answer is to carry an untreated arm through the same protocol, and to report the gain of drug-arm models over a model trained on that arm, with training size matched, next to the raw AUROC. Where that is impossible, we found no reliable substitute. A label-free density score inflated the gain roughly two- to three-fold, and a baseline built from the other treated arms almost erased it, largely because it had more training data than the untreated arm. Together they bracketed the true value in all three ReSisTrace arms, but not in four of the six treatments of the second system. A substitute can indicate that a reported pre-resistance signal is mostly fitness, but not by how much. Studies should also expect a ceiling: because sisters are not identical, even a perfect model of the sequenced cell loses up to about 0.1 AUROC. Finally, the synthetic experiments gave a methodological lesson. Bootstrap intervals that do not refit the model covered the truth well below their nominal rate, so anyone putting a bootstrap around a cross-validated score should refit inside each replicate or check the interval's coverage against a known answer first. The main steps, namely the fitness baseline, the size-matched gain with a family bootstrap interval, the family permutation null and the sister ceiling, are provided as a small package that applies to any lineage-tracing design with an untreated arm; the slower refitting interval is provided as a separate script.</w:t>
+        <w:t xml:space="preserve">What should future studies do? The clearest answer is to carry an untreated arm through the same protocol, and to report the gain of drug-arm models over a model trained on that arm, with training size matched, next to the raw AUROC. Where that is impossible, we found no reliable substitute. A label-free density score inflated the gain roughly two- to three-fold, and a baseline built from the other treated arms almost erased it, largely because it had more training data than the untreated arm. Together they bracketed the true value in all three ReSisTrace arms, but not in four of the six treatments of the second system. A substitute can indicate that a reported pre-resistance signal is mostly fitness, but not by how much. Studies should also expect a ceiling: because sisters are not identical, even a perfect model of the sequenced cell loses an estimated 0.09–0.12 AUROC at most in the drug arms. Finally, the synthetic experiments gave a methodological lesson. Bootstrap intervals that do not refit the model covered the truth well below their nominal rate, so anyone putting a bootstrap around a cross-validated score should refit inside each replicate or check the interval's coverage against a known answer first. The main steps, namely the fitness baseline, the size-matched gain with a family bootstrap interval, the family permutation null and the sister ceiling, are provided as a small package that applies to any lineage-tracing design with an untreated arm; the slower refitting interval is provided as a separate script.</w:t>
       </w:r>
     </w:p>
     <w:p>
@@ -3667,7 +3709,7 @@
             </m:fPr>
             <m:num>
               <m:r>
-                <m:t>k</m:t>
+                <m:t>κ</m:t>
               </m:r>
             </m:num>
             <m:den>
@@ -3986,7 +4028,7 @@
       </w:r>
       <m:oMath>
         <m:r>
-          <m:t>k</m:t>
+          <m:t>κ</m:t>
         </m:r>
       </m:oMath>
       <w:r>
@@ -3994,7 +4036,7 @@
       </w:r>
       <m:oMath>
         <m:r>
-          <m:t>k</m:t>
+          <m:t>κ</m:t>
         </m:r>
       </m:oMath>
       <w:r>
@@ -5741,10 +5783,10 @@
           <w:b/>
           <w:bCs/>
         </w:rPr>
-        <w:t xml:space="preserve">Use of AI tools.</w:t>
-      </w:r>
-      <w:r>
-        <w:t xml:space="preserve"> The author used a large language model to assist with writing code and text, checked all analyses and text, and takes full responsibility for the content.</w:t>
+        <w:t xml:space="preserve">Use of large language models.</w:t>
+      </w:r>
+      <w:r>
+        <w:t xml:space="preserve"> The authors used a large language model to assist with writing code and text, checked all analyses and text, and take full responsibility for the content.</w:t>
       </w:r>
     </w:p>
     <w:p>
@@ -5800,7 +5842,7 @@
         <w:t xml:space="preserve">Availability of data and materials.</w:t>
       </w:r>
       <w:r>
-        <w:t xml:space="preserve"> All data analysed are public: ReSisTrace (GEO GSE223003), Watermelon (GSE150949), the triple-negative breast cancer study (GSE228382, with figshare 24787458), the second lineage system (GSE279162), the patient cohort (GSE165897), and TCGA-OV through UCSC Xena. The code is available at https://github.com/rabeyanoor/SisFate and archived at Zenodo ([ZENODO DOI]) under the MIT licence. The fitness-adjusted evaluation described here (control-arm baseline, size-matched ΔAUROC with a family-level bootstrap interval, family permutation null and sister ceiling) is packaged as a small module, </w:t>
+        <w:t xml:space="preserve"> All data analysed are public: ReSisTrace (GEO GSE223003), Watermelon (GSE150949), the triple-negative breast cancer study (GSE228382, with figshare 24787458), the second lineage system (GSE279162), the patient cohort (GSE165897), and TCGA-OV through UCSC Xena. The code is available at https://github.com/rabeyanoor/SisFate under the MIT licence, and a release will be archived at Zenodo with a DOI on acceptance. The fitness-adjusted evaluation described here (control-arm baseline, size-matched ΔAUROC with a family-level bootstrap interval, family permutation null and sister ceiling) is packaged as a small module, </w:t>
       </w:r>
       <w:r>
         <w:rPr>
@@ -5861,7 +5903,7 @@
         <w:t xml:space="preserve">Competing interests.</w:t>
       </w:r>
       <w:r>
-        <w:t xml:space="preserve"> The author declares no competing interests.</w:t>
+        <w:t xml:space="preserve"> The authors declare that they have no competing interests.</w:t>
       </w:r>
     </w:p>
     <w:p>
@@ -5893,7 +5935,7 @@
         <w:t xml:space="preserve">Authors' contributions.</w:t>
       </w:r>
       <w:r>
-        <w:t xml:space="preserve"> RN conceived the study, carried out all analyses and wrote the paper. The author read and approved the final version.</w:t>
+        <w:t xml:space="preserve"> RN conceived the study, carried out all analyses and wrote the manuscript. KJR contributed to the biological interpretation of the results. Both authors read and approved the final manuscript.</w:t>
       </w:r>
     </w:p>
     <w:p>
@@ -5909,7 +5951,7 @@
         <w:t xml:space="preserve">Acknowledgements.</w:t>
       </w:r>
       <w:r>
-        <w:t xml:space="preserve"> The author thanks the authors of the ReSisTrace, Watermelon, triple-negative breast cancer, multi-treatment melanoma and ovarian cancer patient studies for making their data publicly available, and The Cancer Genome Atlas Research Network.</w:t>
+        <w:t xml:space="preserve"> We thank the authors of the ReSisTrace, Watermelon, triple-negative breast cancer, multi-treatment melanoma and ovarian cancer patient studies for making their data publicly available, and The Cancer Genome Atlas Research Network.</w:t>
       </w:r>
     </w:p>
     <w:p>
@@ -5923,19 +5965,6 @@
       </w:pPr>
       <w:r>
         <w:t xml:space="preserve">References</w:t>
-      </w:r>
-    </w:p>
-    <w:p>
-      <w:pPr>
-        <w:spacing w:after="160" w:line="276"/>
-        <w:jc w:val="left"/>
-      </w:pPr>
-      <w:r>
-        <w:rPr>
-          <w:sz w:val="20"/>
-          <w:szCs w:val="20"/>
-        </w:rPr>
-        <w:t xml:space="preserve">References marked ✓ were checked against their full text; the others were checked against their abstracts, or against the bibliographic record where there is no abstract.</w:t>
       </w:r>
     </w:p>
     <w:p>

</xml_diff>

<commit_message>
Second author: Kumudini Women's Medical College and Hospital; emails of both authors and ORCID on the title page
</commit_message>
<xml_diff>
--- a/SisFatee.docx
+++ b/SisFatee.docx
@@ -62,7 +62,7 @@
         <w:t xml:space="preserve">2</w:t>
       </w:r>
       <w:r>
-        <w:t xml:space="preserve">Kumudini Women's Medical College, Mirzapur, Tangail, Bangladesh</w:t>
+        <w:t xml:space="preserve">Kumudini Women's Medical College and Hospital, Mirzapur, Tangail, Bangladesh</w:t>
       </w:r>
     </w:p>
     <w:p>
@@ -89,14 +89,6 @@
     </w:p>
     <w:p>
       <w:pPr>
-        <w:pStyle w:val="Heading1"/>
-      </w:pPr>
-      <w:r>
-        <w:t xml:space="preserve">Abstract</w:t>
-      </w:r>
-    </w:p>
-    <w:p>
-      <w:pPr>
         <w:spacing w:after="160" w:line="360"/>
         <w:jc w:val="both"/>
       </w:pPr>
@@ -105,10 +97,10 @@
           <w:b/>
           <w:bCs/>
         </w:rPr>
-        <w:t xml:space="preserve">Background.</w:t>
-      </w:r>
-      <w:r>
-        <w:t xml:space="preserve"> Some cancer cells survive treatment without genetic change, and many studies suggest they can be recognised in advance from their gene expression. Sister-cell lineage tracing tests this: one daughter of a dividing cell is sequenced before treatment, the other is treated, and the treated sister's fate labels the sequenced cell. However, a cell whose sister survives may simply be a cell that grows well. How much of the predictable signal reflects drug tolerance rather than general growth fitness has not been measured. We measured it in the ReSisTrace experiment, which includes an identically processed untreated arm.</w:t>
+        <w:t xml:space="preserve">Email addresses:</w:t>
+      </w:r>
+      <w:r>
+        <w:t xml:space="preserve"> RN, rabeyanoor.dev@gmail.com; KJR, kj.roza.dr@gmail.com</w:t>
       </w:r>
     </w:p>
     <w:p>
@@ -121,10 +113,18 @@
           <w:b/>
           <w:bCs/>
         </w:rPr>
-        <w:t xml:space="preserve">Results.</w:t>
-      </w:r>
-      <w:r>
-        <w:t xml:space="preserve"> We built an evaluation that compares each drug-arm predictor with a fitness model trained on the untreated arm at equal training size, and bounds what any predictor can reach given that sisters differ. Applied to 32,642 pre-treatment ovarian cancer cells, a simple linear model predicted the sister's fate (AUROC 0.72–0.75), far above published methods on the same task (0.50–0.60), and neither a graph neural network nor two single-cell foundation models did better. Yet the fitness model, which never saw a drug, predicted drug-arm fates almost as well (0.70–0.73). The drug-specific gain was about 0.02 AUROC: positive in every arm, too small for this experiment to separate reliably from zero, and at most about 0.05. Point estimates placed most of it with the particular drug, not with treatment in general. A score that uses no labels recovered much of the signal, which marked a proliferative, low-stress state, and a link to homologous-recombination-deficient states reported with these data was as strong in untreated cells. In a second lineage system with six treatments, pre-treatment clone size outpredicted gene expression under every treatment, and in 11 patients the fitness state was depleted, not enriched, after chemotherapy.</w:t>
+        <w:t xml:space="preserve">ORCID iD:</w:t>
+      </w:r>
+      <w:r>
+        <w:t xml:space="preserve"> 0009-0007-2839-0900 (KJR)</w:t>
+      </w:r>
+    </w:p>
+    <w:p>
+      <w:pPr>
+        <w:pStyle w:val="Heading1"/>
+      </w:pPr>
+      <w:r>
+        <w:t xml:space="preserve">Abstract</w:t>
       </w:r>
     </w:p>
     <w:p>
@@ -137,10 +137,42 @@
           <w:b/>
           <w:bCs/>
         </w:rPr>
+        <w:t xml:space="preserve">Background.</w:t>
+      </w:r>
+      <w:r>
+        <w:t xml:space="preserve"> Some cancer cells survive treatment without genetic change, and many studies suggest they can be recognised in advance from their gene expression. Sister-cell lineage tracing tests this: one daughter of a dividing cell is sequenced before treatment and the other is treated. However, a cell whose sister survives may simply grow well. How much of the predictable signal reflects drug tolerance rather than growth fitness is unknown.</w:t>
+      </w:r>
+    </w:p>
+    <w:p>
+      <w:pPr>
+        <w:spacing w:after="160" w:line="360"/>
+        <w:jc w:val="both"/>
+      </w:pPr>
+      <w:r>
+        <w:rPr>
+          <w:b/>
+          <w:bCs/>
+        </w:rPr>
+        <w:t xml:space="preserve">Results.</w:t>
+      </w:r>
+      <w:r>
+        <w:t xml:space="preserve"> In the ReSisTrace experiment, which includes an identically processed untreated arm, we compared each drug-arm predictor with a fitness model trained on untreated cells at equal training size. In 32,642 pre-treatment ovarian cancer cells, a linear model predicted the sister's fate with AUROC 0.72–0.75, far above published methods (0.50–0.60); a graph neural network and two single-cell foundation models did no better. The fitness model, which never saw a drug, reached 0.70–0.73. The drug-specific gain was about 0.02 AUROC: positive in every arm, not reliably separable from zero, and at most about 0.05. The shared signal marked a proliferative, low-stress state, and a label-free score recovered much of it. In a second lineage system with six treatments, pre-treatment clone size outpredicted gene expression under every treatment, and in 11 patients the fitness state was depleted, not enriched, after chemotherapy.</w:t>
+      </w:r>
+    </w:p>
+    <w:p>
+      <w:pPr>
+        <w:spacing w:after="160" w:line="360"/>
+        <w:jc w:val="both"/>
+      </w:pPr>
+      <w:r>
+        <w:rPr>
+          <w:b/>
+          <w:bCs/>
+        </w:rPr>
         <w:t xml:space="preserve">Conclusions.</w:t>
       </w:r>
       <w:r>
-        <w:t xml:space="preserve"> Most of what a pre-treatment transcriptome predicts about a cancer cell's fate is general growth fitness, not drug tolerance. Claims that pre-existing states predict drug tolerance should therefore be tested against an untreated arm processed in the same way. We provide the evaluation as an open-source Python package, </w:t>
+        <w:t xml:space="preserve"> Most of what a pre-treatment transcriptome predicts about a cancer cell's fate is growth fitness, not drug tolerance. Such claims should be tested against an untreated arm processed in the same way; our open-source package </w:t>
       </w:r>
       <w:r>
         <w:rPr>
@@ -149,7 +181,7 @@
         <w:t xml:space="preserve">persist.fitadj</w:t>
       </w:r>
       <w:r>
-        <w:t xml:space="preserve">, which applies to any lineage-tracing design with such an arm.</w:t>
+        <w:t xml:space="preserve"> does this for any lineage-tracing design.</w:t>
       </w:r>
     </w:p>
     <w:p>
@@ -613,7 +645,1162 @@
         <w:jc w:val="both"/>
       </w:pPr>
       <w:r>
-        <w:t xml:space="preserve">If a more flexible model could find more signal, the values above would understate what the data contain. We found no such gain. Tuning the regularisation strength and the number of components changed AUROC by at most 0.002, and adding labelled cells from the other arms by at most 0.004. Gradient boosting was slightly worse (0.70–0.73), and linear models on 2,000 individual genes were worse still (0.63–0.66). A graph neural network, which lets each cell draw on information from cells in similar states and was pretrained to place sisters close together, reached 0.696–0.734, below logistic regression in every arm, and no setting in a sweep of its hyperparameters did better (Fig. S1, Tables S1, S18; Supplementary Note 1). Cell embeddings from Geneformer, a transformer pretrained on 104 million human transcriptomes and continually pretrained on about 14 million cancer transcriptomes (Theodoris et al., 2023; Chen et al., 2026), reached 0.671–0.683, and embeddings from scGPT, a transformer pretrained on 33 million human cells (Cui et al., 2024), reached 0.673–0.693 (Table S17; these two models are not shown in Fig. 2a). Models ranging from a linear classifier to a 104-million-parameter transformer thus recover the same signal and no more. The limit lies in the information, not in the model.</w:t>
+        <w:t xml:space="preserve">If a more flexible model could find more signal, the values above would understate what the data contain. We found no such gain. Tuning the regularisation strength and the number of components changed AUROC by at most 0.002, and adding labelled cells from the other arms by at most 0.004. Gradient boosting was slightly worse (0.70–0.73), and linear models on 2,000 individual genes were worse still (0.63–0.66). A graph neural network, which lets each cell draw on information from cells in similar states and was pretrained to place sisters close together, reached 0.696–0.734, below logistic regression in every arm, and no setting in a sweep of its hyperparameters did better (Fig. S1, Tables S1, S18; Supplementary Note 1). Cell embeddings from Geneformer, a transformer pretrained on 104 million human transcriptomes and continually pretrained on about 14 million cancer transcriptomes (Theodoris et al., 2023; Chen et al., 2026), reached 0.671–0.683 in the drug arms, and embeddings from scGPT, a transformer pretrained on 33 million human cells (Cui et al., 2024), reached 0.673–0.693 (Table S17; these two models are not shown in Fig. 2a). Models ranging from a linear classifier to a 104-million-parameter transformer thus recover the same signal and no more. The limit lies in the information, not in the model. Table 1 lists every model and representation used in this study, what each one takes as input, and how well it did.</w:t>
+      </w:r>
+    </w:p>
+    <w:p>
+      <w:pPr>
+        <w:spacing w:after="160" w:line="360"/>
+        <w:jc w:val="both"/>
+      </w:pPr>
+      <w:r>
+        <w:rPr>
+          <w:b/>
+          <w:bCs/>
+        </w:rPr>
+        <w:t xml:space="preserve">Table 1</w:t>
+      </w:r>
+      <w:r>
+        <w:t xml:space="preserve"> </w:t>
+      </w:r>
+      <w:r>
+        <w:rPr>
+          <w:b/>
+          <w:bCs/>
+        </w:rPr>
+        <w:t xml:space="preserve">Models and representations used in this study.</w:t>
+      </w:r>
+    </w:p>
+    <w:tbl>
+      <w:tblPr>
+        <w:tblW w:type="pct" w:w="100%"/>
+        <w:tblBorders>
+          <w:top w:val="single" w:color="auto" w:sz="4"/>
+          <w:left w:val="single" w:color="auto" w:sz="4"/>
+          <w:bottom w:val="single" w:color="auto" w:sz="4"/>
+          <w:right w:val="single" w:color="auto" w:sz="4"/>
+          <w:insideH w:val="single" w:color="auto" w:sz="4"/>
+          <w:insideV w:val="single" w:color="auto" w:sz="4"/>
+        </w:tblBorders>
+      </w:tblPr>
+      <w:tblGrid>
+        <w:gridCol w:w="100"/>
+        <w:gridCol w:w="100"/>
+        <w:gridCol w:w="100"/>
+        <w:gridCol w:w="100"/>
+      </w:tblGrid>
+      <w:tr>
+        <w:trPr>
+          <w:tblHeader/>
+        </w:trPr>
+        <w:tc>
+          <w:p>
+            <w:pPr>
+              <w:spacing w:after="40"/>
+            </w:pPr>
+            <w:r>
+              <w:rPr>
+                <w:b/>
+                <w:bCs/>
+                <w:sz w:val="18"/>
+                <w:szCs w:val="18"/>
+              </w:rPr>
+              <w:t xml:space="preserve">Model</w:t>
+            </w:r>
+          </w:p>
+        </w:tc>
+        <w:tc>
+          <w:p>
+            <w:pPr>
+              <w:spacing w:after="40"/>
+            </w:pPr>
+            <w:r>
+              <w:rPr>
+                <w:b/>
+                <w:bCs/>
+                <w:sz w:val="18"/>
+                <w:szCs w:val="18"/>
+              </w:rPr>
+              <w:t xml:space="preserve">What it is</w:t>
+            </w:r>
+          </w:p>
+        </w:tc>
+        <w:tc>
+          <w:p>
+            <w:pPr>
+              <w:spacing w:after="40"/>
+            </w:pPr>
+            <w:r>
+              <w:rPr>
+                <w:b/>
+                <w:bCs/>
+                <w:sz w:val="18"/>
+                <w:szCs w:val="18"/>
+              </w:rPr>
+              <w:t xml:space="preserve">Input</w:t>
+            </w:r>
+          </w:p>
+        </w:tc>
+        <w:tc>
+          <w:p>
+            <w:pPr>
+              <w:spacing w:after="40"/>
+            </w:pPr>
+            <w:r>
+              <w:rPr>
+                <w:b/>
+                <w:bCs/>
+                <w:sz w:val="18"/>
+                <w:szCs w:val="18"/>
+              </w:rPr>
+              <w:t xml:space="preserve">Result (AUROC unless stated)</w:t>
+            </w:r>
+          </w:p>
+        </w:tc>
+      </w:tr>
+      <w:tr>
+        <w:trPr>
+          <w:tblHeader w:val="false"/>
+        </w:trPr>
+        <w:tc>
+          <w:p>
+            <w:pPr>
+              <w:spacing w:after="40"/>
+            </w:pPr>
+            <w:r>
+              <w:rPr>
+                <w:b w:val="false"/>
+                <w:bCs w:val="false"/>
+                <w:sz w:val="18"/>
+                <w:szCs w:val="18"/>
+              </w:rPr>
+              <w:t xml:space="preserve">Logistic regression (main model)</w:t>
+            </w:r>
+          </w:p>
+        </w:tc>
+        <w:tc>
+          <w:p>
+            <w:pPr>
+              <w:spacing w:after="40"/>
+            </w:pPr>
+            <w:r>
+              <w:rPr>
+                <w:b w:val="false"/>
+                <w:bCs w:val="false"/>
+                <w:sz w:val="18"/>
+                <w:szCs w:val="18"/>
+              </w:rPr>
+              <w:t xml:space="preserve">Linear classifier with balanced class weights</w:t>
+            </w:r>
+          </w:p>
+        </w:tc>
+        <w:tc>
+          <w:p>
+            <w:pPr>
+              <w:spacing w:after="40"/>
+            </w:pPr>
+            <w:r>
+              <w:rPr>
+                <w:b w:val="false"/>
+                <w:bCs w:val="false"/>
+                <w:sz w:val="18"/>
+                <w:szCs w:val="18"/>
+              </w:rPr>
+              <w:t xml:space="preserve">50 principal components of expression</w:t>
+            </w:r>
+          </w:p>
+        </w:tc>
+        <w:tc>
+          <w:p>
+            <w:pPr>
+              <w:spacing w:after="40"/>
+            </w:pPr>
+            <w:r>
+              <w:rPr>
+                <w:b w:val="false"/>
+                <w:bCs w:val="false"/>
+                <w:sz w:val="18"/>
+                <w:szCs w:val="18"/>
+              </w:rPr>
+              <w:t xml:space="preserve">0.708–0.747 within each arm</w:t>
+            </w:r>
+          </w:p>
+        </w:tc>
+      </w:tr>
+      <w:tr>
+        <w:trPr>
+          <w:tblHeader w:val="false"/>
+        </w:trPr>
+        <w:tc>
+          <w:p>
+            <w:pPr>
+              <w:spacing w:after="40"/>
+            </w:pPr>
+            <w:r>
+              <w:rPr>
+                <w:b w:val="false"/>
+                <w:bCs w:val="false"/>
+                <w:sz w:val="18"/>
+                <w:szCs w:val="18"/>
+              </w:rPr>
+              <w:t xml:space="preserve">Tuned or pooled logistic regression</w:t>
+            </w:r>
+          </w:p>
+        </w:tc>
+        <w:tc>
+          <w:p>
+            <w:pPr>
+              <w:spacing w:after="40"/>
+            </w:pPr>
+            <w:r>
+              <w:rPr>
+                <w:b w:val="false"/>
+                <w:bCs w:val="false"/>
+                <w:sz w:val="18"/>
+                <w:szCs w:val="18"/>
+              </w:rPr>
+              <w:t xml:space="preserve">Main model with tuned settings, or with labelled cells from the other arms added</w:t>
+            </w:r>
+          </w:p>
+        </w:tc>
+        <w:tc>
+          <w:p>
+            <w:pPr>
+              <w:spacing w:after="40"/>
+            </w:pPr>
+            <w:r>
+              <w:rPr>
+                <w:b w:val="false"/>
+                <w:bCs w:val="false"/>
+                <w:sz w:val="18"/>
+                <w:szCs w:val="18"/>
+              </w:rPr>
+              <w:t xml:space="preserve">50 principal components</w:t>
+            </w:r>
+          </w:p>
+        </w:tc>
+        <w:tc>
+          <w:p>
+            <w:pPr>
+              <w:spacing w:after="40"/>
+            </w:pPr>
+            <w:r>
+              <w:rPr>
+                <w:b w:val="false"/>
+                <w:bCs w:val="false"/>
+                <w:sz w:val="18"/>
+                <w:szCs w:val="18"/>
+              </w:rPr>
+              <w:t xml:space="preserve">Changed AUROC by at most 0.002 (tuned) and 0.004 (pooled)</w:t>
+            </w:r>
+          </w:p>
+        </w:tc>
+      </w:tr>
+      <w:tr>
+        <w:trPr>
+          <w:tblHeader w:val="false"/>
+        </w:trPr>
+        <w:tc>
+          <w:p>
+            <w:pPr>
+              <w:spacing w:after="40"/>
+            </w:pPr>
+            <w:r>
+              <w:rPr>
+                <w:b w:val="false"/>
+                <w:bCs w:val="false"/>
+                <w:sz w:val="18"/>
+                <w:szCs w:val="18"/>
+              </w:rPr>
+              <w:t xml:space="preserve">Logistic regression on genes</w:t>
+            </w:r>
+          </w:p>
+        </w:tc>
+        <w:tc>
+          <w:p>
+            <w:pPr>
+              <w:spacing w:after="40"/>
+            </w:pPr>
+            <w:r>
+              <w:rPr>
+                <w:b w:val="false"/>
+                <w:bCs w:val="false"/>
+                <w:sz w:val="18"/>
+                <w:szCs w:val="18"/>
+              </w:rPr>
+              <w:t xml:space="preserve">Main model applied to single genes</w:t>
+            </w:r>
+          </w:p>
+        </w:tc>
+        <w:tc>
+          <w:p>
+            <w:pPr>
+              <w:spacing w:after="40"/>
+            </w:pPr>
+            <w:r>
+              <w:rPr>
+                <w:b w:val="false"/>
+                <w:bCs w:val="false"/>
+                <w:sz w:val="18"/>
+                <w:szCs w:val="18"/>
+              </w:rPr>
+              <w:t xml:space="preserve">2000 highly variable genes</w:t>
+            </w:r>
+          </w:p>
+        </w:tc>
+        <w:tc>
+          <w:p>
+            <w:pPr>
+              <w:spacing w:after="40"/>
+            </w:pPr>
+            <w:r>
+              <w:rPr>
+                <w:b w:val="false"/>
+                <w:bCs w:val="false"/>
+                <w:sz w:val="18"/>
+                <w:szCs w:val="18"/>
+              </w:rPr>
+              <w:t xml:space="preserve">0.63–0.66</w:t>
+            </w:r>
+          </w:p>
+        </w:tc>
+      </w:tr>
+      <w:tr>
+        <w:trPr>
+          <w:tblHeader w:val="false"/>
+        </w:trPr>
+        <w:tc>
+          <w:p>
+            <w:pPr>
+              <w:spacing w:after="40"/>
+            </w:pPr>
+            <w:r>
+              <w:rPr>
+                <w:b w:val="false"/>
+                <w:bCs w:val="false"/>
+                <w:sz w:val="18"/>
+                <w:szCs w:val="18"/>
+              </w:rPr>
+              <w:t xml:space="preserve">Technical-covariate model</w:t>
+            </w:r>
+          </w:p>
+        </w:tc>
+        <w:tc>
+          <w:p>
+            <w:pPr>
+              <w:spacing w:after="40"/>
+            </w:pPr>
+            <w:r>
+              <w:rPr>
+                <w:b w:val="false"/>
+                <w:bCs w:val="false"/>
+                <w:sz w:val="18"/>
+                <w:szCs w:val="18"/>
+              </w:rPr>
+              <w:t xml:space="preserve">Logistic regression on technical factors only</w:t>
+            </w:r>
+          </w:p>
+        </w:tc>
+        <w:tc>
+          <w:p>
+            <w:pPr>
+              <w:spacing w:after="40"/>
+            </w:pPr>
+            <w:r>
+              <w:rPr>
+                <w:b w:val="false"/>
+                <w:bCs w:val="false"/>
+                <w:sz w:val="18"/>
+                <w:szCs w:val="18"/>
+              </w:rPr>
+              <w:t xml:space="preserve">Sequencing depth, detected genes, mitochondrial fraction, cell-cycle scores</w:t>
+            </w:r>
+          </w:p>
+        </w:tc>
+        <w:tc>
+          <w:p>
+            <w:pPr>
+              <w:spacing w:after="40"/>
+            </w:pPr>
+            <w:r>
+              <w:rPr>
+                <w:b w:val="false"/>
+                <w:bCs w:val="false"/>
+                <w:sz w:val="18"/>
+                <w:szCs w:val="18"/>
+              </w:rPr>
+              <w:t xml:space="preserve">0.59–0.65</w:t>
+            </w:r>
+          </w:p>
+        </w:tc>
+      </w:tr>
+      <w:tr>
+        <w:trPr>
+          <w:tblHeader w:val="false"/>
+        </w:trPr>
+        <w:tc>
+          <w:p>
+            <w:pPr>
+              <w:spacing w:after="40"/>
+            </w:pPr>
+            <w:r>
+              <w:rPr>
+                <w:b w:val="false"/>
+                <w:bCs w:val="false"/>
+                <w:sz w:val="18"/>
+                <w:szCs w:val="18"/>
+              </w:rPr>
+              <w:t xml:space="preserve">Gradient boosting (CatBoost)</w:t>
+            </w:r>
+          </w:p>
+        </w:tc>
+        <w:tc>
+          <w:p>
+            <w:pPr>
+              <w:spacing w:after="40"/>
+            </w:pPr>
+            <w:r>
+              <w:rPr>
+                <w:b w:val="false"/>
+                <w:bCs w:val="false"/>
+                <w:sz w:val="18"/>
+                <w:szCs w:val="18"/>
+              </w:rPr>
+              <w:t xml:space="preserve">Ensemble of decision trees</w:t>
+            </w:r>
+          </w:p>
+        </w:tc>
+        <w:tc>
+          <w:p>
+            <w:pPr>
+              <w:spacing w:after="40"/>
+            </w:pPr>
+            <w:r>
+              <w:rPr>
+                <w:b w:val="false"/>
+                <w:bCs w:val="false"/>
+                <w:sz w:val="18"/>
+                <w:szCs w:val="18"/>
+              </w:rPr>
+              <w:t xml:space="preserve">Principal components and technical covariates</w:t>
+            </w:r>
+          </w:p>
+        </w:tc>
+        <w:tc>
+          <w:p>
+            <w:pPr>
+              <w:spacing w:after="40"/>
+            </w:pPr>
+            <w:r>
+              <w:rPr>
+                <w:b w:val="false"/>
+                <w:bCs w:val="false"/>
+                <w:sz w:val="18"/>
+                <w:szCs w:val="18"/>
+              </w:rPr>
+              <w:t xml:space="preserve">0.70–0.73</w:t>
+            </w:r>
+          </w:p>
+        </w:tc>
+      </w:tr>
+      <w:tr>
+        <w:trPr>
+          <w:tblHeader w:val="false"/>
+        </w:trPr>
+        <w:tc>
+          <w:p>
+            <w:pPr>
+              <w:spacing w:after="40"/>
+            </w:pPr>
+            <w:r>
+              <w:rPr>
+                <w:b w:val="false"/>
+                <w:bCs w:val="false"/>
+                <w:sz w:val="18"/>
+                <w:szCs w:val="18"/>
+              </w:rPr>
+              <w:t xml:space="preserve">Multilayer perceptron</w:t>
+            </w:r>
+          </w:p>
+        </w:tc>
+        <w:tc>
+          <w:p>
+            <w:pPr>
+              <w:spacing w:after="40"/>
+            </w:pPr>
+            <w:r>
+              <w:rPr>
+                <w:b w:val="false"/>
+                <w:bCs w:val="false"/>
+                <w:sz w:val="18"/>
+                <w:szCs w:val="18"/>
+              </w:rPr>
+              <w:t xml:space="preserve">Small neural network, with or without sister-pair pretraining</w:t>
+            </w:r>
+          </w:p>
+        </w:tc>
+        <w:tc>
+          <w:p>
+            <w:pPr>
+              <w:spacing w:after="40"/>
+            </w:pPr>
+            <w:r>
+              <w:rPr>
+                <w:b w:val="false"/>
+                <w:bCs w:val="false"/>
+                <w:sz w:val="18"/>
+                <w:szCs w:val="18"/>
+              </w:rPr>
+              <w:t xml:space="preserve">50 principal components</w:t>
+            </w:r>
+          </w:p>
+        </w:tc>
+        <w:tc>
+          <w:p>
+            <w:pPr>
+              <w:spacing w:after="40"/>
+            </w:pPr>
+            <w:r>
+              <w:rPr>
+                <w:b w:val="false"/>
+                <w:bCs w:val="false"/>
+                <w:sz w:val="18"/>
+                <w:szCs w:val="18"/>
+              </w:rPr>
+              <w:t xml:space="preserve">0.700–0.738 without and 0.708–0.742 with pretraining</w:t>
+            </w:r>
+          </w:p>
+        </w:tc>
+      </w:tr>
+      <w:tr>
+        <w:trPr>
+          <w:tblHeader w:val="false"/>
+        </w:trPr>
+        <w:tc>
+          <w:p>
+            <w:pPr>
+              <w:spacing w:after="40"/>
+            </w:pPr>
+            <w:r>
+              <w:rPr>
+                <w:b w:val="false"/>
+                <w:bCs w:val="false"/>
+                <w:sz w:val="18"/>
+                <w:szCs w:val="18"/>
+              </w:rPr>
+              <w:t xml:space="preserve">Graph neural network</w:t>
+            </w:r>
+          </w:p>
+        </w:tc>
+        <w:tc>
+          <w:p>
+            <w:pPr>
+              <w:spacing w:after="40"/>
+            </w:pPr>
+            <w:r>
+              <w:rPr>
+                <w:b w:val="false"/>
+                <w:bCs w:val="false"/>
+                <w:sz w:val="18"/>
+                <w:szCs w:val="18"/>
+              </w:rPr>
+              <w:t xml:space="preserve">Neural network that also reads each cell's 15 nearest neighbours, pretrained so that sisters lie close together</w:t>
+            </w:r>
+          </w:p>
+        </w:tc>
+        <w:tc>
+          <w:p>
+            <w:pPr>
+              <w:spacing w:after="40"/>
+            </w:pPr>
+            <w:r>
+              <w:rPr>
+                <w:b w:val="false"/>
+                <w:bCs w:val="false"/>
+                <w:sz w:val="18"/>
+                <w:szCs w:val="18"/>
+              </w:rPr>
+              <w:t xml:space="preserve">50 principal components and a cell–cell graph</w:t>
+            </w:r>
+          </w:p>
+        </w:tc>
+        <w:tc>
+          <w:p>
+            <w:pPr>
+              <w:spacing w:after="40"/>
+            </w:pPr>
+            <w:r>
+              <w:rPr>
+                <w:b w:val="false"/>
+                <w:bCs w:val="false"/>
+                <w:sz w:val="18"/>
+                <w:szCs w:val="18"/>
+              </w:rPr>
+              <w:t xml:space="preserve">0.696–0.734</w:t>
+            </w:r>
+          </w:p>
+        </w:tc>
+      </w:tr>
+      <w:tr>
+        <w:trPr>
+          <w:tblHeader w:val="false"/>
+        </w:trPr>
+        <w:tc>
+          <w:p>
+            <w:pPr>
+              <w:spacing w:after="40"/>
+            </w:pPr>
+            <w:r>
+              <w:rPr>
+                <w:b w:val="false"/>
+                <w:bCs w:val="false"/>
+                <w:sz w:val="18"/>
+                <w:szCs w:val="18"/>
+              </w:rPr>
+              <w:t xml:space="preserve">Geneformer V2-104M_CLcancer</w:t>
+            </w:r>
+          </w:p>
+        </w:tc>
+        <w:tc>
+          <w:p>
+            <w:pPr>
+              <w:spacing w:after="40"/>
+            </w:pPr>
+            <w:r>
+              <w:rPr>
+                <w:b w:val="false"/>
+                <w:bCs w:val="false"/>
+                <w:sz w:val="18"/>
+                <w:szCs w:val="18"/>
+              </w:rPr>
+              <w:t xml:space="preserve">Transformer with 104 million parameters, pretrained on 104 million human and about 14 million cancer transcriptomes; used without fine-tuning</w:t>
+            </w:r>
+          </w:p>
+        </w:tc>
+        <w:tc>
+          <w:p>
+            <w:pPr>
+              <w:spacing w:after="40"/>
+            </w:pPr>
+            <w:r>
+              <w:rPr>
+                <w:b w:val="false"/>
+                <w:bCs w:val="false"/>
+                <w:sz w:val="18"/>
+                <w:szCs w:val="18"/>
+              </w:rPr>
+              <w:t xml:space="preserve">Raw counts as a ranked list of genes, giving a 768-dimensional embedding</w:t>
+            </w:r>
+          </w:p>
+        </w:tc>
+        <w:tc>
+          <w:p>
+            <w:pPr>
+              <w:spacing w:after="40"/>
+            </w:pPr>
+            <w:r>
+              <w:rPr>
+                <w:b w:val="false"/>
+                <w:bCs w:val="false"/>
+                <w:sz w:val="18"/>
+                <w:szCs w:val="18"/>
+              </w:rPr>
+              <w:t xml:space="preserve">0.671–0.683 (drug arms)</w:t>
+            </w:r>
+          </w:p>
+        </w:tc>
+      </w:tr>
+      <w:tr>
+        <w:trPr>
+          <w:tblHeader w:val="false"/>
+        </w:trPr>
+        <w:tc>
+          <w:p>
+            <w:pPr>
+              <w:spacing w:after="40"/>
+            </w:pPr>
+            <w:r>
+              <w:rPr>
+                <w:b w:val="false"/>
+                <w:bCs w:val="false"/>
+                <w:sz w:val="18"/>
+                <w:szCs w:val="18"/>
+              </w:rPr>
+              <w:t xml:space="preserve">scGPT (whole-human)</w:t>
+            </w:r>
+          </w:p>
+        </w:tc>
+        <w:tc>
+          <w:p>
+            <w:pPr>
+              <w:spacing w:after="40"/>
+            </w:pPr>
+            <w:r>
+              <w:rPr>
+                <w:b w:val="false"/>
+                <w:bCs w:val="false"/>
+                <w:sz w:val="18"/>
+                <w:szCs w:val="18"/>
+              </w:rPr>
+              <w:t xml:space="preserve">Transformer pretrained on 33 million human cells; used without fine-tuning</w:t>
+            </w:r>
+          </w:p>
+        </w:tc>
+        <w:tc>
+          <w:p>
+            <w:pPr>
+              <w:spacing w:after="40"/>
+            </w:pPr>
+            <w:r>
+              <w:rPr>
+                <w:b w:val="false"/>
+                <w:bCs w:val="false"/>
+                <w:sz w:val="18"/>
+                <w:szCs w:val="18"/>
+              </w:rPr>
+              <w:t xml:space="preserve">Raw counts of 5005 genes, giving a 512-dimensional embedding</w:t>
+            </w:r>
+          </w:p>
+        </w:tc>
+        <w:tc>
+          <w:p>
+            <w:pPr>
+              <w:spacing w:after="40"/>
+            </w:pPr>
+            <w:r>
+              <w:rPr>
+                <w:b w:val="false"/>
+                <w:bCs w:val="false"/>
+                <w:sz w:val="18"/>
+                <w:szCs w:val="18"/>
+              </w:rPr>
+              <w:t xml:space="preserve">0.673–0.693 (drug arms)</w:t>
+            </w:r>
+          </w:p>
+        </w:tc>
+      </w:tr>
+      <w:tr>
+        <w:trPr>
+          <w:tblHeader w:val="false"/>
+        </w:trPr>
+        <w:tc>
+          <w:p>
+            <w:pPr>
+              <w:spacing w:after="40"/>
+            </w:pPr>
+            <w:r>
+              <w:rPr>
+                <w:b w:val="false"/>
+                <w:bCs w:val="false"/>
+                <w:sz w:val="18"/>
+                <w:szCs w:val="18"/>
+              </w:rPr>
+              <w:t xml:space="preserve">Harmony, Pearson residuals, scVI</w:t>
+            </w:r>
+          </w:p>
+        </w:tc>
+        <w:tc>
+          <w:p>
+            <w:pPr>
+              <w:spacing w:after="40"/>
+            </w:pPr>
+            <w:r>
+              <w:rPr>
+                <w:b w:val="false"/>
+                <w:bCs w:val="false"/>
+                <w:sz w:val="18"/>
+                <w:szCs w:val="18"/>
+              </w:rPr>
+              <w:t xml:space="preserve">Batch-corrected components, components of analytic Pearson residuals, and the latent space of a variational autoencoder</w:t>
+            </w:r>
+          </w:p>
+        </w:tc>
+        <w:tc>
+          <w:p>
+            <w:pPr>
+              <w:spacing w:after="40"/>
+            </w:pPr>
+            <w:r>
+              <w:rPr>
+                <w:b w:val="false"/>
+                <w:bCs w:val="false"/>
+                <w:sz w:val="18"/>
+                <w:szCs w:val="18"/>
+              </w:rPr>
+              <w:t xml:space="preserve">Expression of the same 2000 genes</w:t>
+            </w:r>
+          </w:p>
+        </w:tc>
+        <w:tc>
+          <w:p>
+            <w:pPr>
+              <w:spacing w:after="40"/>
+            </w:pPr>
+            <w:r>
+              <w:rPr>
+                <w:b w:val="false"/>
+                <w:bCs w:val="false"/>
+                <w:sz w:val="18"/>
+                <w:szCs w:val="18"/>
+              </w:rPr>
+              <w:t xml:space="preserve">Same conclusions as the main model (Table S17)</w:t>
+            </w:r>
+          </w:p>
+        </w:tc>
+      </w:tr>
+      <w:tr>
+        <w:trPr>
+          <w:tblHeader w:val="false"/>
+        </w:trPr>
+        <w:tc>
+          <w:p>
+            <w:pPr>
+              <w:spacing w:after="40"/>
+            </w:pPr>
+            <w:r>
+              <w:rPr>
+                <w:b w:val="false"/>
+                <w:bCs w:val="false"/>
+                <w:sz w:val="18"/>
+                <w:szCs w:val="18"/>
+              </w:rPr>
+              <w:t xml:space="preserve">Fitness model</w:t>
+            </w:r>
+          </w:p>
+        </w:tc>
+        <w:tc>
+          <w:p>
+            <w:pPr>
+              <w:spacing w:after="40"/>
+            </w:pPr>
+            <w:r>
+              <w:rPr>
+                <w:b w:val="false"/>
+                <w:bCs w:val="false"/>
+                <w:sz w:val="18"/>
+                <w:szCs w:val="18"/>
+              </w:rPr>
+              <w:t xml:space="preserve">Main model trained on the untreated control arm</w:t>
+            </w:r>
+          </w:p>
+        </w:tc>
+        <w:tc>
+          <w:p>
+            <w:pPr>
+              <w:spacing w:after="40"/>
+            </w:pPr>
+            <w:r>
+              <w:rPr>
+                <w:b w:val="false"/>
+                <w:bCs w:val="false"/>
+                <w:sz w:val="18"/>
+                <w:szCs w:val="18"/>
+              </w:rPr>
+              <w:t xml:space="preserve">50 principal components</w:t>
+            </w:r>
+          </w:p>
+        </w:tc>
+        <w:tc>
+          <w:p>
+            <w:pPr>
+              <w:spacing w:after="40"/>
+            </w:pPr>
+            <w:r>
+              <w:rPr>
+                <w:b w:val="false"/>
+                <w:bCs w:val="false"/>
+                <w:sz w:val="18"/>
+                <w:szCs w:val="18"/>
+              </w:rPr>
+              <w:t xml:space="preserve">0.70–0.73 on drug-arm labels</w:t>
+            </w:r>
+          </w:p>
+        </w:tc>
+      </w:tr>
+      <w:tr>
+        <w:trPr>
+          <w:tblHeader w:val="false"/>
+        </w:trPr>
+        <w:tc>
+          <w:p>
+            <w:pPr>
+              <w:spacing w:after="40"/>
+            </w:pPr>
+            <w:r>
+              <w:rPr>
+                <w:b w:val="false"/>
+                <w:bCs w:val="false"/>
+                <w:sz w:val="18"/>
+                <w:szCs w:val="18"/>
+              </w:rPr>
+              <w:t xml:space="preserve">Other-arm model</w:t>
+            </w:r>
+          </w:p>
+        </w:tc>
+        <w:tc>
+          <w:p>
+            <w:pPr>
+              <w:spacing w:after="40"/>
+            </w:pPr>
+            <w:r>
+              <w:rPr>
+                <w:b w:val="false"/>
+                <w:bCs w:val="false"/>
+                <w:sz w:val="18"/>
+                <w:szCs w:val="18"/>
+              </w:rPr>
+              <w:t xml:space="preserve">Main model trained on the other two drug arms</w:t>
+            </w:r>
+          </w:p>
+        </w:tc>
+        <w:tc>
+          <w:p>
+            <w:pPr>
+              <w:spacing w:after="40"/>
+            </w:pPr>
+            <w:r>
+              <w:rPr>
+                <w:b w:val="false"/>
+                <w:bCs w:val="false"/>
+                <w:sz w:val="18"/>
+                <w:szCs w:val="18"/>
+              </w:rPr>
+              <w:t xml:space="preserve">50 principal components</w:t>
+            </w:r>
+          </w:p>
+        </w:tc>
+        <w:tc>
+          <w:p>
+            <w:pPr>
+              <w:spacing w:after="40"/>
+            </w:pPr>
+            <w:r>
+              <w:rPr>
+                <w:b w:val="false"/>
+                <w:bCs w:val="false"/>
+                <w:sz w:val="18"/>
+                <w:szCs w:val="18"/>
+              </w:rPr>
+              <w:t xml:space="preserve">Gain over the fitness model of 0.004 to 0.006</w:t>
+            </w:r>
+          </w:p>
+        </w:tc>
+      </w:tr>
+      <w:tr>
+        <w:trPr>
+          <w:tblHeader w:val="false"/>
+        </w:trPr>
+        <w:tc>
+          <w:p>
+            <w:pPr>
+              <w:spacing w:after="40"/>
+            </w:pPr>
+            <w:r>
+              <w:rPr>
+                <w:b w:val="false"/>
+                <w:bCs w:val="false"/>
+                <w:sz w:val="18"/>
+                <w:szCs w:val="18"/>
+              </w:rPr>
+              <w:t xml:space="preserve">Label-free density score</w:t>
+            </w:r>
+          </w:p>
+        </w:tc>
+        <w:tc>
+          <w:p>
+            <w:pPr>
+              <w:spacing w:after="40"/>
+            </w:pPr>
+            <w:r>
+              <w:rPr>
+                <w:b w:val="false"/>
+                <w:bCs w:val="false"/>
+                <w:sz w:val="18"/>
+                <w:szCs w:val="18"/>
+              </w:rPr>
+              <w:t xml:space="preserve">Mean distance to the 15 nearest neighbours; uses no labels</w:t>
+            </w:r>
+          </w:p>
+        </w:tc>
+        <w:tc>
+          <w:p>
+            <w:pPr>
+              <w:spacing w:after="40"/>
+            </w:pPr>
+            <w:r>
+              <w:rPr>
+                <w:b w:val="false"/>
+                <w:bCs w:val="false"/>
+                <w:sz w:val="18"/>
+                <w:szCs w:val="18"/>
+              </w:rPr>
+              <w:t xml:space="preserve">50 principal components</w:t>
+            </w:r>
+          </w:p>
+        </w:tc>
+        <w:tc>
+          <w:p>
+            <w:pPr>
+              <w:spacing w:after="40"/>
+            </w:pPr>
+            <w:r>
+              <w:rPr>
+                <w:b w:val="false"/>
+                <w:bCs w:val="false"/>
+                <w:sz w:val="18"/>
+                <w:szCs w:val="18"/>
+              </w:rPr>
+              <w:t xml:space="preserve">0.63 for NK cells to 0.70 for carboplatin</w:t>
+            </w:r>
+          </w:p>
+        </w:tc>
+      </w:tr>
+      <w:tr>
+        <w:trPr>
+          <w:tblHeader w:val="false"/>
+        </w:trPr>
+        <w:tc>
+          <w:p>
+            <w:pPr>
+              <w:spacing w:after="40"/>
+            </w:pPr>
+            <w:r>
+              <w:rPr>
+                <w:b w:val="false"/>
+                <w:bCs w:val="false"/>
+                <w:sz w:val="18"/>
+                <w:szCs w:val="18"/>
+              </w:rPr>
+              <w:t xml:space="preserve">Sister ceiling</w:t>
+            </w:r>
+          </w:p>
+        </w:tc>
+        <w:tc>
+          <w:p>
+            <w:pPr>
+              <w:spacing w:after="40"/>
+            </w:pPr>
+            <w:r>
+              <w:rPr>
+                <w:b w:val="false"/>
+                <w:bCs w:val="false"/>
+                <w:sz w:val="18"/>
+                <w:szCs w:val="18"/>
+              </w:rPr>
+              <w:t xml:space="preserve">Bivariate-normal latent-liability model</w:t>
+            </w:r>
+          </w:p>
+        </w:tc>
+        <w:tc>
+          <w:p>
+            <w:pPr>
+              <w:spacing w:after="40"/>
+            </w:pPr>
+            <w:r>
+              <w:rPr>
+                <w:b w:val="false"/>
+                <w:bCs w:val="false"/>
+                <w:sz w:val="18"/>
+                <w:szCs w:val="18"/>
+              </w:rPr>
+              <w:t xml:space="preserve">Model scores of pre-treatment sister pairs</w:t>
+            </w:r>
+          </w:p>
+        </w:tc>
+        <w:tc>
+          <w:p>
+            <w:pPr>
+              <w:spacing w:after="40"/>
+            </w:pPr>
+            <w:r>
+              <w:rPr>
+                <w:b w:val="false"/>
+                <w:bCs w:val="false"/>
+                <w:sz w:val="18"/>
+                <w:szCs w:val="18"/>
+              </w:rPr>
+              <w:t xml:space="preserve">About 0.84 (drug arms) and 0.76 (control) if the treated sister were scored</w:t>
+            </w:r>
+          </w:p>
+        </w:tc>
+      </w:tr>
+      <w:tr>
+        <w:trPr>
+          <w:tblHeader w:val="false"/>
+        </w:trPr>
+        <w:tc>
+          <w:p>
+            <w:pPr>
+              <w:spacing w:after="40"/>
+            </w:pPr>
+            <w:r>
+              <w:rPr>
+                <w:b w:val="false"/>
+                <w:bCs w:val="false"/>
+                <w:sz w:val="18"/>
+                <w:szCs w:val="18"/>
+              </w:rPr>
+              <w:t xml:space="preserve">Cox regression</w:t>
+            </w:r>
+          </w:p>
+        </w:tc>
+        <w:tc>
+          <w:p>
+            <w:pPr>
+              <w:spacing w:after="40"/>
+            </w:pPr>
+            <w:r>
+              <w:rPr>
+                <w:b w:val="false"/>
+                <w:bCs w:val="false"/>
+                <w:sz w:val="18"/>
+                <w:szCs w:val="18"/>
+              </w:rPr>
+              <w:t xml:space="preserve">Proportional-hazards survival model</w:t>
+            </w:r>
+          </w:p>
+        </w:tc>
+        <w:tc>
+          <w:p>
+            <w:pPr>
+              <w:spacing w:after="40"/>
+            </w:pPr>
+            <w:r>
+              <w:rPr>
+                <w:b w:val="false"/>
+                <w:bCs w:val="false"/>
+                <w:sz w:val="18"/>
+                <w:szCs w:val="18"/>
+              </w:rPr>
+              <w:t xml:space="preserve">Signature scores of 303 TCGA ovarian tumours</w:t>
+            </w:r>
+          </w:p>
+        </w:tc>
+        <w:tc>
+          <w:p>
+            <w:pPr>
+              <w:spacing w:after="40"/>
+            </w:pPr>
+            <w:r>
+              <w:rPr>
+                <w:b w:val="false"/>
+                <w:bCs w:val="false"/>
+                <w:sz w:val="18"/>
+                <w:szCs w:val="18"/>
+              </w:rPr>
+              <w:t xml:space="preserve">Hazard ratios (Fig. 7c)</w:t>
+            </w:r>
+          </w:p>
+        </w:tc>
+      </w:tr>
+    </w:tbl>
+    <w:p>
+      <w:pPr>
+        <w:spacing w:after="160" w:line="360"/>
+        <w:jc w:val="both"/>
+      </w:pPr>
+      <w:r>
+        <w:t xml:space="preserve">AUROC, area under the receiver operating characteristic curve. Ranges are over the four arms, or over the three drug arms where stated, from lineage-grouped five-fold cross-validation. Methods give full settings for every model.</w:t>
       </w:r>
     </w:p>
     <w:p>
@@ -790,7 +1977,25 @@
         <w:jc w:val="both"/>
       </w:pPr>
       <w:r>
-        <w:t xml:space="preserve">Whether this gain would reappear in a new experiment is harder to establish, because the experiment is too small to resolve it. A design calculation shows that, with 3,879 labelled control families, the experiment can detect a gain of about 0.025 to 0.028 with 80% power, and every estimate falls below that. As expected from this, in the main analysis intervals that account for refitting the models do not exclude zero. When we repeated the whole procedure inside each of 200 bootstrap samples, refitting both models each time, the estimates were 0.017 for carboplatin (95% CI −0.0002 to 0.043), 0.022 for olaparib (−0.004 to 0.046) and 0.014 for NK (−0.010 to 0.043) (Table S27); the point estimates differ slightly from those above because the random training sets differ. Across all nine combinations of arm and preprocessing variant, the gain exceeded 0.01 in eight and was close to zero in the ninth (NK with all technical covariates removed, 0.001). Two intervals only just excluded zero, both with cell cycle removed (carboplatin 0.001 to 0.044, olaparib 0.0004 to 0.047). With nine overlapping comparisons and lower ends this close to zero, we do not count these as detections. The three-model bootstrap behind Fig. 3d, which draws its own training sets, gave total-gain intervals that excluded zero for olaparib (0.007 to 0.051) and NK (0.001 to 0.049) but not for carboplatin (−0.007 to 0.042) (Table S28). Whether an interval clears zero therefore depends on the random training sets, which is what an effect at the edge of detection looks like. Simpler intervals that resample only the evaluation, without refitting, do exclude zero in all three arms, but our simulations show that such intervals are too narrow (see below). The best summary is a drug-specific gain of about 0.02 AUROC that is consistent in sign but that this experiment cannot reliably separate from zero. The same intervals also bound it from above, which is the more useful statement here: even at their upper ends, the gain is at most 0.043 to 0.046 AUROC, less than a fifth of the 0.22 to 0.25 by which the drug-arm models exceed chance. The data therefore do not merely fail to detect a large drug-specific component; they exclude one larger than about 0.05 AUROC.</w:t>
+        <w:t xml:space="preserve">Is this gain real, or could it be chance? The experiment is too small to say for certain. A design calculation shows that, with 3,879 labelled control families, the experiment can detect a gain of about 0.025 to 0.028 with 80% power, and every estimate falls below that. As expected from this, intervals that account for refitting the models do not exclude zero in the main analysis. When we repeated the whole procedure inside each of 200 bootstrap samples, refitting both models each time, the estimates were 0.017 for carboplatin (95% CI −0.0002 to 0.043), 0.022 for olaparib (−0.004 to 0.046) and 0.014 for NK (−0.010 to 0.043) (Table S27). These point estimates differ slightly from those above because the random training sets differ.</w:t>
+      </w:r>
+    </w:p>
+    <w:p>
+      <w:pPr>
+        <w:spacing w:after="160" w:line="360"/>
+        <w:jc w:val="both"/>
+      </w:pPr>
+      <w:r>
+        <w:t xml:space="preserve">Other versions of the analysis tell the same story. Across all nine combinations of arm and preprocessing variant, the gain exceeded 0.01 in eight and was close to zero in the ninth (NK with all technical covariates removed, 0.001). Two intervals only just excluded zero, both with cell cycle removed (carboplatin 0.001 to 0.044, olaparib 0.0004 to 0.047). With nine overlapping comparisons and lower ends this close to zero, we do not count these as detections. The three-model bootstrap behind Fig. 3d, which draws its own training sets, gave total-gain intervals that excluded zero for olaparib (0.007 to 0.051) and NK (0.001 to 0.049) but not for carboplatin (−0.007 to 0.042) (Table S28). Whether an interval clears zero therefore depends on the random training sets, which is what an effect at the edge of detection looks like. Simpler intervals that resample only the evaluation, without refitting, do exclude zero in all three arms, but our simulations show that such intervals are too narrow (see below).</w:t>
+      </w:r>
+    </w:p>
+    <w:p>
+      <w:pPr>
+        <w:spacing w:after="160" w:line="360"/>
+        <w:jc w:val="both"/>
+      </w:pPr>
+      <w:r>
+        <w:t xml:space="preserve">In short, the drug-specific gain is about 0.02 AUROC. It has the same sign in every arm, but this experiment cannot reliably separate it from zero. The same intervals also give an upper limit, which is the more useful result here: even at their upper ends, the gain is at most 0.043 to 0.046 AUROC, less than a fifth of the 0.22 to 0.25 by which the drug-arm models exceed chance. The data therefore do more than fail to detect a large drug-specific component; they rule out one larger than about 0.05 AUROC.</w:t>
       </w:r>
     </w:p>
     <w:p>
@@ -860,7 +2065,25 @@
         <w:jc w:val="both"/>
       </w:pPr>
       <w:r>
-        <w:t xml:space="preserve">The shared fitness component is a proliferative, low-stress state. In the control arm, cells whose sisters were recovered had higher MYC-target, mTORC1, E2F and fatty-acid-metabolism programmes, and lower TNF-α/NF-κB, TGF-β, interferon, p53 and apoptosis programmes (Fig. 4a, Table S9), which fits an advantage in re-plating and regrowth. The drug-specific component points the other way. After the control comparison was subtracted, E2F targets, mitotic spindle and MYC targets were lower in pre-resistant cells in all three drug arms, and for carboplatin and NK cells so were the G2-M checkpoint and DNA repair. Among cells that are otherwise fit, those whose sisters survived a drug were relatively less proliferative. This agrees with the original report that DNA replication was associated with pre-survival only in the control condition (Dai et al., 2024). A pre-specified panel of 28 marker genes gave the same picture at the level of single genes (Fig. S3, Table S16, Supplementary Note 2). The CDK inhibitors CDKN1A, CDKN1B and CDKN1C were markedly lower in recovered cells of the control arm, and CDK1, PCNA, MCM2 and E2F1 were lower in pre-resistant cells of all three drug arms, although only CDK1 and PCNA for NK cells passed correction. Senescence-associated secretory genes were not higher, so the drug-specific state looks like slower cycling among otherwise fit cells rather than senescence. Genes unique to one drug, judged against the other two drug arms rather than against the control, were few (8 for carboplatin, 4 for olaparib and 48 for NK cells; Table S29), and neither pathway hypothesis fixed before this test held after correction. DNA-repair genes were higher in olaparib pre-resistant cells, as expected if cells proficient in homologous recombination resist PARP inhibition, but only nominally (p = 0.042, adjusted 0.094); for NK cells, allograft-rejection genes were nominally lower (p = 0.047, adjusted 0.094) and interferon-γ response genes did not differ. The part of the signal unique to a drug is therefore spread thinly across many genes rather than concentrated in a known mechanism.</w:t>
+        <w:t xml:space="preserve">The shared fitness component is a proliferative, low-stress state. In the control arm, cells whose sisters were recovered had higher MYC-target, mTORC1, E2F and fatty-acid-metabolism programmes, and lower TNF-α/NF-κB, TGF-β, interferon, p53 and apoptosis programmes (Fig. 4a, Table S9). This fits an advantage in re-plating and regrowth.</w:t>
+      </w:r>
+    </w:p>
+    <w:p>
+      <w:pPr>
+        <w:spacing w:after="160" w:line="360"/>
+        <w:jc w:val="both"/>
+      </w:pPr>
+      <w:r>
+        <w:t xml:space="preserve">The drug-specific component points the other way. After the control comparison was subtracted, E2F targets, mitotic spindle and MYC targets were lower in pre-resistant cells in all three drug arms, and for carboplatin and NK cells so were the G2-M checkpoint and DNA repair. In other words, among cells that are otherwise fit, those whose sisters survived a drug were relatively less proliferative. This agrees with the original report that DNA replication was associated with pre-survival only in the control condition (Dai et al., 2024). A pre-specified panel of 28 marker genes gave the same picture at the level of single genes (Fig. S3, Table S16, Supplementary Note 2). The CDK inhibitors CDKN1A, CDKN1B and CDKN1C were markedly lower in recovered cells of the control arm, and CDK1, PCNA, MCM2 and E2F1 were lower in pre-resistant cells of all three drug arms, although only CDK1 and PCNA for NK cells passed correction. Senescence-associated secretory genes were not higher. The drug-specific state therefore looks like slower cycling among otherwise fit cells, not senescence.</w:t>
+      </w:r>
+    </w:p>
+    <w:p>
+      <w:pPr>
+        <w:spacing w:after="160" w:line="360"/>
+        <w:jc w:val="both"/>
+      </w:pPr>
+      <w:r>
+        <w:t xml:space="preserve">Few genes were unique to a single drug when each drug arm was compared with the other two drug arms rather than with the control: 8 for carboplatin, 4 for olaparib and 48 for NK cells (Table S29). Neither of the two pathway hypotheses we fixed before this test held after correction. DNA-repair genes were higher in olaparib pre-resistant cells, as expected if cells proficient in homologous recombination resist PARP inhibition, but only nominally (p = 0.042, adjusted 0.094). For NK cells, allograft-rejection genes were nominally lower (p = 0.047, adjusted 0.094), and interferon-γ response genes did not differ. The part of the signal unique to a drug is therefore spread thinly across many genes rather than concentrated in a known mechanism.</w:t>
       </w:r>
     </w:p>
     <w:p>
@@ -1514,7 +2737,16 @@
         <w:jc w:val="both"/>
       </w:pPr>
       <w:r>
-        <w:t xml:space="preserve">In patients, the fitness state was depleted after chemotherapy. Bulk survival data are an indirect test; a more direct one asks whether cancer cells that persist through chemotherapy in patients carry the pre-resistant states. Zhang et al. (2022) sequenced malignant cells from 11 patients with high-grade serous ovarian cancer before and after three cycles of neoadjuvant platinum–taxane chemotherapy (8,806 malignant cells). If treatment selected the ReSisTrace carboplatin states, post-treatment cells should score higher on them than the same patient's treatment-naive cells. They did not. The carboplatin whole-contrast and carboplatin-specific signatures rose in only 5 of 11 patients (Wilcoxon p = 0.24 and 0.83), within the range of random gene sets matched in size and expression. The fitness signature moved the other way. It was lower after treatment in 7 of 11 patients (median change −0.18 within-patient s.d.; Wilcoxon p = 0.042), lower than for all 200 matched random gene sets (two-sided p = 0.005), and lower in all five patients whose two samples came from the same anatomical site (Fig. 7d, Table S21). No signature change was associated with the platinum-free interval (all p &gt; 0.3). The proliferative, low-stress state that predicts recovery in a culture dish is therefore depleted, not enriched, in tumours after chemotherapy. This fits the view that it marks the ability to regrow after handling rather than tolerance of the drug. Post-treatment tumour samples also differ in ways a sister design does not capture, such as drug-induced changes, stroma and sampling site, so this is a consistency check rather than a validation.</w:t>
+        <w:t xml:space="preserve">In patients, the fitness state was depleted after chemotherapy. Bulk survival data are an indirect test; a more direct one asks whether cancer cells that persist through chemotherapy in patients carry the pre-resistant states. Zhang et al. (2022) sequenced malignant cells from 11 patients with high-grade serous ovarian cancer before and after three cycles of neoadjuvant platinum–taxane chemotherapy (8,806 malignant cells). If treatment selected the ReSisTrace carboplatin states, post-treatment cells should score higher on them than the same patient's treatment-naive cells. They did not. The carboplatin whole-contrast and carboplatin-specific signatures rose in only 5 of 11 patients (Wilcoxon p = 0.24 and 0.83), within the range of random gene sets matched in size and expression.</w:t>
+      </w:r>
+    </w:p>
+    <w:p>
+      <w:pPr>
+        <w:spacing w:after="160" w:line="360"/>
+        <w:jc w:val="both"/>
+      </w:pPr>
+      <w:r>
+        <w:t xml:space="preserve">The fitness signature moved the other way. It was lower after treatment in 7 of 11 patients (median change −0.18 within-patient s.d.; Wilcoxon p = 0.042), lower than for all 200 matched random gene sets (two-sided p = 0.005), and lower in all five patients whose two samples came from the same anatomical site (Fig. 7d, Table S21). No signature change was associated with the platinum-free interval (all p &gt; 0.3). The proliferative, low-stress state that predicts recovery in a culture dish is therefore depleted, not enriched, in tumours after chemotherapy. This fits the view that it marks the ability to regrow after handling rather than tolerance of the drug. Post-treatment tumour samples also differ in ways a sister design does not capture, such as drug-induced changes, stroma and sampling site, so this is a consistency check rather than a validation.</w:t>
       </w:r>
     </w:p>
     <w:p>
@@ -1610,7 +2842,7 @@
         <w:jc w:val="both"/>
       </w:pPr>
       <w:r>
-        <w:t xml:space="preserve">We asked whether a cancer cell's transcriptome before treatment predicts whether its sister survives, and how much of that prediction is about the drug. The pre-treatment state is predictive: a simple model reaches AUROC 0.72–0.75, far above published methods on the same task. But most of the signal is not about the drug. A model trained on cells that never saw a drug predicts drug-arm fates nearly as well; a score that uses no labels recovers much of the same signal; and the shared component is a proliferative, low-stress state that fits an advantage in growing back after handling. The drug-specific remainder is biologically coherent, pointing to slower cycling among otherwise fit cells, and it is positive in every arm, but it is worth one to three points of AUROC and this experiment cannot reliably separate it from zero once the uncertainty of fitting is counted. Point estimates suggest that most of that remainder is tied to the particular drug rather than to being treated at all, because a model trained on the other treated arms, at the same size, recovered only a fifth to a third of it, although this split is less certain than the gain itself and was clear only for olaparib.</w:t>
+        <w:t xml:space="preserve">We asked two questions. Does a cancer cell's transcriptome before treatment predict whether its sister survives, and how much of that prediction is about the drug? The pre-treatment state is predictive: a simple model reaches AUROC 0.72–0.75, far above published methods on the same task. But most of the signal is not about the drug. A model trained on cells that never saw a drug predicts drug-arm fates nearly as well. A score that uses no labels recovers much of the same signal. And the shared component is a proliferative, low-stress state, which fits an advantage in growing back after handling. The drug-specific remainder makes biological sense, pointing to slower cycling among otherwise fit cells, and it is positive in every arm. But it is worth only one to three points of AUROC, and this experiment cannot reliably separate it from zero once the uncertainty of fitting is counted. Point estimates suggest that most of the remainder is tied to the particular drug rather than to being treated at all, because a model trained on the other treated arms, at the same size, recovered only a fifth to a third of it. This split is less certain than the gain itself, and it was clear only for olaparib.</w:t>
       </w:r>
     </w:p>
     <w:p>
@@ -1655,16 +2887,34 @@
         <w:jc w:val="both"/>
       </w:pPr>
       <w:r>
-        <w:t xml:space="preserve">What should future studies do? The clearest answer is to carry an untreated arm through the same protocol, and to report the gain of drug-arm models over a model trained on that arm, with training size matched, next to the raw AUROC. Where that is impossible, we found no reliable substitute. A label-free density score inflated the gain roughly two- to three-fold, and a baseline built from the other treated arms almost erased it, largely because it had more training data than the untreated arm. Together they bracketed the true value in all three ReSisTrace arms, but not in four of the six treatments of the second system. A substitute can indicate that a reported pre-resistance signal is mostly fitness, but not by how much. Studies should also expect a ceiling: because sisters are not identical, even a perfect model of the sequenced cell loses an estimated 0.09–0.12 AUROC at most in the drug arms. Finally, the synthetic experiments gave a methodological lesson. Bootstrap intervals that do not refit the model covered the truth well below their nominal rate, so anyone putting a bootstrap around a cross-validated score should refit inside each replicate or check the interval's coverage against a known answer first. The main steps, namely the fitness baseline, the size-matched gain with a family bootstrap interval, the family permutation null and the sister ceiling, are provided as a small package that applies to any lineage-tracing design with an untreated arm; the slower refitting interval is provided as a separate script.</w:t>
-      </w:r>
-    </w:p>
-    <w:p>
-      <w:pPr>
-        <w:spacing w:after="160" w:line="360"/>
-        <w:jc w:val="both"/>
-      </w:pPr>
-      <w:r>
-        <w:t xml:space="preserve">This study has limitations. First, ReSisTrace labels are noisy: cells whose sister was lost or only partially matched are counted as pre-sensitive, and our ceiling handles this only through an assumed noise level. Second, the ceiling rests on a simplified Gaussian liability model that assumes a single linear score, so it is approximate and, as shown above, an upper bound. Third, our copy-number clusters were inferred from expression and only weakly separated; they reproduced the published enrichment pattern, but they are not the original subclone calls, and copy number measured from DNA in the same cells, which this data set does not provide, would be needed to exclude a copy-number contribution completely. Fourth, differential expression treated the cells of a sample as independent observations. Because 90% of families consist of a single labelled cell, holding 81% of labelled cells, sisters add little dependence, but gene-level p-values may be slightly optimistic; all classifier evaluations kept families together. Fifth, all main analyses use one ovarian cancer cell line, and the external checks rely on clone-level labels, on bulk tumours, and on a patient cohort of 11 in which the two samples are different pieces of tissue rather than sisters, so a negative result there has several possible causes. Sixth, the second system has no drug-free arm, so clone size stands in for fitness there, and lineage detection stands in for survival. Our barcode assignment there is also simpler than the original authors', so our clone counts are not identical to theirs, although the conclusions held across the thresholds we tried. Finally, we tested one graph architecture with modest tuning, and used both foundation models as frozen feature extractors rather than fine-tuning them. A different design might do better, but the near-identical performance of very different models, from logistic regression to a 104-million-parameter transformer, suggests that the information, not the model, is the limit.</w:t>
+        <w:t xml:space="preserve">What should future studies do? The clearest answer is to carry an untreated arm through the same protocol, and to report the gain of drug-arm models over a model trained on that arm, with training size matched, next to the raw AUROC. Where that is impossible, we found no reliable substitute. A label-free density score inflated the gain roughly two- to three-fold, and a baseline built from the other treated arms almost erased it, largely because it had more training data than the untreated arm. Together they bracketed the true value in all three ReSisTrace arms, but not in four of the six treatments of the second system. A substitute can indicate that a reported pre-resistance signal is mostly fitness, but not by how much. Studies should also expect a ceiling: because sisters are not identical, even a perfect model of the sequenced cell loses an estimated 0.09–0.12 AUROC at most in the drug arms.</w:t>
+      </w:r>
+    </w:p>
+    <w:p>
+      <w:pPr>
+        <w:spacing w:after="160" w:line="360"/>
+        <w:jc w:val="both"/>
+      </w:pPr>
+      <w:r>
+        <w:t xml:space="preserve">The synthetic experiments also gave a methodological lesson. Bootstrap intervals that do not refit the model covered the truth well below their nominal rate, so anyone putting a bootstrap around a cross-validated score should refit inside each replicate or check the interval's coverage against a known answer first. We provide the main steps as a small package that works for any lineage-tracing design with an untreated arm: the fitness baseline, the size-matched gain with a family bootstrap interval, the family permutation null and the sister ceiling. The slower refitting interval is provided as a separate script.</w:t>
+      </w:r>
+    </w:p>
+    <w:p>
+      <w:pPr>
+        <w:spacing w:after="160" w:line="360"/>
+        <w:jc w:val="both"/>
+      </w:pPr>
+      <w:r>
+        <w:t xml:space="preserve">This study has limitations. First, ReSisTrace labels are noisy: cells whose sister was lost or only partially matched are counted as pre-sensitive, and our ceiling handles this only through an assumed noise level. Second, the ceiling rests on a simplified Gaussian liability model that assumes a single linear score, so it is approximate and, as shown above, an upper bound. Third, our copy-number clusters were inferred from expression and only weakly separated; they reproduced the published enrichment pattern, but they are not the original subclone calls, and copy number measured from DNA in the same cells, which this data set does not provide, would be needed to exclude a copy-number contribution completely. Fourth, differential expression treated the cells of a sample as independent observations. Because 90% of families consist of a single labelled cell, holding 81% of labelled cells, sisters add little dependence, but gene-level p-values may be slightly optimistic; all classifier evaluations kept families together.</w:t>
+      </w:r>
+    </w:p>
+    <w:p>
+      <w:pPr>
+        <w:spacing w:after="160" w:line="360"/>
+        <w:jc w:val="both"/>
+      </w:pPr>
+      <w:r>
+        <w:t xml:space="preserve">The scope of the study is also limited. Fifth, all main analyses use one ovarian cancer cell line, and the external checks rely on clone-level labels, on bulk tumours, and on a patient cohort of 11 in which the two samples are different pieces of tissue rather than sisters, so a negative result there has several possible causes. Sixth, the second system has no drug-free arm, so clone size stands in for fitness there, and lineage detection stands in for survival. Our barcode assignment there is also simpler than the original authors', so our clone counts are not identical to theirs, although the conclusions held across the thresholds we tried. Finally, we tested one graph architecture with modest tuning, and used both foundation models as frozen feature extractors rather than fine-tuning them. A different design might do better, but the near-identical performance of very different models, from logistic regression to a 104-million-parameter transformer, suggests that the information, not the model, is the limit.</w:t>
       </w:r>
     </w:p>
     <w:p>
@@ -1681,7 +2931,7 @@
         <w:jc w:val="both"/>
       </w:pPr>
       <w:r>
-        <w:t xml:space="preserve">A cancer cell's transcriptome before treatment predicts whether its sister survives well above chance, and far better than transfer-learning methods suggested on the same data. Most of that signal, however, is not about the drug. It is shared with cells that were never treated, it tracks a proliferative, low-stress state and how typical a cell is, and in a second lineage system its counterpart, clone size, outweighs expression under every treatment. The drug-specific remainder is small, consistent in sign and below what the experiment can resolve; point estimates place most of it with the particular drug rather than with treatment in general, clearly so only for olaparib, and it is spread thinly across many genes rather than concentrated in a known mechanism. The imperfect similarity of sisters caps what any model of the sequenced cell can reach. No substitute built without an untreated arm measured that remainder reliably. Studies that claim a pre-existing state predicts drug tolerance should therefore carry an untreated arm through the same protocol and report the gain over it, with training size matched; the package provided here does this for any design with such an arm.</w:t>
+        <w:t xml:space="preserve">A cancer cell's transcriptome before treatment predicts whether its sister survives. It does so well above chance, and far better than transfer-learning methods suggested on the same data. Most of that signal, however, is not about the drug. It is shared with cells that were never treated, and it tracks a proliferative, low-stress state and how typical a cell is. In a second lineage system, its counterpart, clone size, outweighs expression under every treatment. The drug-specific remainder is small and consistent in sign, but below what this experiment can resolve. Point estimates place most of it with the particular drug rather than with treatment in general, clearly so only for olaparib, and it is spread thinly across many genes rather than concentrated in a known mechanism. Because sisters are not identical, no model of the sequenced cell can predict perfectly. No substitute built without an untreated arm measured the drug-specific remainder reliably. Studies that claim a pre-existing state predicts drug tolerance should therefore carry an untreated arm through the same protocol and report the gain over it, with training size matched. The package provided here does this for any design with such an arm.</w:t>
       </w:r>
     </w:p>
     <w:p>
@@ -5643,7 +6893,19 @@
         <w:t xml:space="preserve">Copy-number clusters.</w:t>
       </w:r>
       <w:r>
-        <w:t xml:space="preserve"> Genes detected in at least 10% of cells in every sample and located on GENCODE v44 autosomes or chromosome X (11,883 genes) were normalised and log-transformed. Each sample was analysed with infercnvpy (https://github.com/icbi-lab/infercnvpy; window of 100 genes, step 10), following the approach of InferCNV (Patel et al., 2014), against one fixed reference panel of 200 random cells from each pre-treatment sample. Profiles were pooled, reduced to 20 principal components and clustered by k-means, with k from 2 to 8 chosen by silhouette. Enrichment was tested with Fisher's exact test and Benjamini–Hochberg correction. Confound tests compared grouped out-of-fold predictions from cluster identity, expression and both, within-cluster AUROC, and a likelihood-ratio test for expression beyond cluster identity.</w:t>
+        <w:t xml:space="preserve"> Genes detected in at least 10% of cells in every sample and located on GENCODE v44 autosomes or chromosome X (11,883 genes) were normalised and log-transformed. Each sample was analysed with infercnvpy (</w:t>
+      </w:r>
+      <w:hyperlink w:history="1" r:id="rIdhtcdqusanxawe8yndxejg">
+        <w:r>
+          <w:rPr>
+            <w:color w:val="0563C1"/>
+            <w:u w:val="single"/>
+          </w:rPr>
+          <w:t xml:space="preserve">https://github.com/icbi-lab/infercnvpy</w:t>
+        </w:r>
+      </w:hyperlink>
+      <w:r>
+        <w:t xml:space="preserve">; window of 100 genes, step 10), following the approach of InferCNV (Patel et al., 2014), against one fixed reference panel of 200 random cells from each pre-treatment sample. Profiles were pooled, reduced to 20 principal components and clustered by k-means, with k from 2 to 8 chosen by silhouette. Enrichment was tested with Fisher's exact test and Benjamini–Hochberg correction. Confound tests compared grouped out-of-fold predictions from cluster identity, expression and both, within-cluster AUROC, and a likelihood-ratio test for expression beyond cluster identity.</w:t>
       </w:r>
     </w:p>
     <w:p>
@@ -5842,7 +7104,19 @@
         <w:t xml:space="preserve">Availability of data and materials.</w:t>
       </w:r>
       <w:r>
-        <w:t xml:space="preserve"> All data analysed are public: ReSisTrace (GEO GSE223003), Watermelon (GSE150949), the triple-negative breast cancer study (GSE228382, with figshare 24787458), the second lineage system (GSE279162), the patient cohort (GSE165897), and TCGA-OV through UCSC Xena. The code is available at https://github.com/rabeyanoor/SisFate under the MIT licence, and a release will be archived at Zenodo with a DOI on acceptance. The fitness-adjusted evaluation described here (control-arm baseline, size-matched ΔAUROC with a family-level bootstrap interval, family permutation null and sister ceiling) is packaged as a small module, </w:t>
+        <w:t xml:space="preserve"> All data analysed are public: ReSisTrace (GEO GSE223003), Watermelon (GSE150949), the triple-negative breast cancer study (GSE228382, with figshare 24787458), the second lineage system (GSE279162), the patient cohort (GSE165897), and TCGA-OV through UCSC Xena. The code is available at </w:t>
+      </w:r>
+      <w:hyperlink w:history="1" r:id="rIdjppnzvsj4nndy5lgbvd9f">
+        <w:r>
+          <w:rPr>
+            <w:color w:val="0563C1"/>
+            <w:u w:val="single"/>
+          </w:rPr>
+          <w:t xml:space="preserve">https://github.com/rabeyanoor/SisFate</w:t>
+        </w:r>
+      </w:hyperlink>
+      <w:r>
+        <w:t xml:space="preserve"> under the MIT licence, and a release will be archived at Zenodo with a DOI on acceptance. The fitness-adjusted evaluation described here (control-arm baseline, size-matched ΔAUROC with a family-level bootstrap interval, family permutation null and sister ceiling) is packaged as a small module, </w:t>
       </w:r>
       <w:r>
         <w:rPr>

</xml_diff>